<commit_message>
Deploy preview for PR 61 🛫
</commit_message>
<xml_diff>
--- a/pr-preview/pr-61/demo-include-in-header.docx
+++ b/pr-preview/pr-61/demo-include-in-header.docx
@@ -1540,6 +1540,448 @@
       </w:tr>
     </w:tbl>
     <w:bookmarkEnd w:id="10"/>
+    <w:bookmarkStart w:id="13" w:name="color-macros"/>
+    <w:p>
+      <w:pPr>
+        <w:pStyle w:val="Heading2"/>
+      </w:pPr>
+      <w:r>
+        <w:t xml:space="preserve">Color macros</w:t>
+      </w:r>
+    </w:p>
+    <w:p>
+      <w:pPr>
+        <w:pStyle w:val="FirstParagraph"/>
+      </w:pPr>
+      <w:r>
+        <w:rPr>
+          <w:rStyle w:val="VerbatimChar"/>
+        </w:rPr>
+        <w:t xml:space="preserve">macros.qmd</w:t>
+      </w:r>
+      <w:r>
+        <w:t xml:space="preserve"> </w:t>
+      </w:r>
+      <w:r>
+        <w:t xml:space="preserve">defines a one-argument macro for each of the 19</w:t>
+      </w:r>
+      <w:r>
+        <w:t xml:space="preserve"> </w:t>
+      </w:r>
+      <w:hyperlink r:id="rId11">
+        <w:r>
+          <w:rPr>
+            <w:rStyle w:val="Hyperlink"/>
+          </w:rPr>
+          <w:t xml:space="preserve">LaTeX base colors</w:t>
+        </w:r>
+      </w:hyperlink>
+      <w:r>
+        <w:t xml:space="preserve"> </w:t>
+      </w:r>
+      <w:r>
+        <w:t xml:space="preserve">(</w:t>
+      </w:r>
+      <w:r>
+        <w:rPr>
+          <w:rStyle w:val="VerbatimChar"/>
+        </w:rPr>
+        <w:t xml:space="preserve">\red</w:t>
+      </w:r>
+      <w:r>
+        <w:t xml:space="preserve">,</w:t>
+      </w:r>
+      <w:r>
+        <w:t xml:space="preserve"> </w:t>
+      </w:r>
+      <w:r>
+        <w:rPr>
+          <w:rStyle w:val="VerbatimChar"/>
+        </w:rPr>
+        <w:t xml:space="preserve">\blue</w:t>
+      </w:r>
+      <w:r>
+        <w:t xml:space="preserve">,</w:t>
+      </w:r>
+      <w:r>
+        <w:t xml:space="preserve"> </w:t>
+      </w:r>
+      <w:r>
+        <w:rPr>
+          <w:rStyle w:val="VerbatimChar"/>
+        </w:rPr>
+        <w:t xml:space="preserve">\green</w:t>
+      </w:r>
+      <w:r>
+        <w:t xml:space="preserve">,</w:t>
+      </w:r>
+      <w:r>
+        <w:t xml:space="preserve"> </w:t>
+      </w:r>
+      <w:r>
+        <w:rPr>
+          <w:rStyle w:val="VerbatimChar"/>
+        </w:rPr>
+        <w:t xml:space="preserve">\orange</w:t>
+      </w:r>
+      <w:r>
+        <w:t xml:space="preserve">, …), using the</w:t>
+      </w:r>
+      <w:r>
+        <w:t xml:space="preserve"> </w:t>
+      </w:r>
+      <w:r>
+        <w:rPr>
+          <w:rStyle w:val="VerbatimChar"/>
+        </w:rPr>
+        <w:t xml:space="preserve">\color</w:t>
+      </w:r>
+      <w:r>
+        <w:t xml:space="preserve"> </w:t>
+      </w:r>
+      <w:r>
+        <w:t xml:space="preserve">switch form (</w:t>
+      </w:r>
+      <w:r>
+        <w:rPr>
+          <w:rStyle w:val="VerbatimChar"/>
+        </w:rPr>
+        <w:t xml:space="preserve">{\color{red}{#1}}</w:t>
+      </w:r>
+      <w:r>
+        <w:t xml:space="preserve">), which is supported by MathJax (HTML/RevealJS) and lualatex (PDF):</w:t>
+      </w:r>
+    </w:p>
+    <w:tbl>
+      <w:tblPr>
+        <w:tblStyle w:val="Table"/>
+        <w:tblW w:type="pct" w:w="5000"/>
+        <w:tblLayout w:type="fixed"/>
+        <w:tblLook w:firstRow="1" w:lastRow="0" w:firstColumn="0" w:lastColumn="0" w:noHBand="0" w:noVBand="0" w:val="0020"/>
+      </w:tblPr>
+      <w:tblGrid>
+        <w:gridCol w:w="2640"/>
+        <w:gridCol w:w="2640"/>
+        <w:gridCol w:w="2640"/>
+      </w:tblGrid>
+      <w:tr>
+        <w:trPr>
+          <w:tblHeader w:val="on"/>
+        </w:trPr>
+        <w:tc>
+          <w:tcPr/>
+          <w:p>
+            <w:pPr>
+              <w:pStyle w:val="Compact"/>
+            </w:pPr>
+            <w:r>
+              <w:t xml:space="preserve">Description</w:t>
+            </w:r>
+          </w:p>
+        </w:tc>
+        <w:tc>
+          <w:tcPr/>
+          <w:p>
+            <w:pPr>
+              <w:pStyle w:val="Compact"/>
+            </w:pPr>
+            <w:r>
+              <w:t xml:space="preserve">Code</w:t>
+            </w:r>
+          </w:p>
+        </w:tc>
+        <w:tc>
+          <w:tcPr/>
+          <w:p>
+            <w:pPr>
+              <w:pStyle w:val="Compact"/>
+            </w:pPr>
+            <w:r>
+              <w:t xml:space="preserve">Output</w:t>
+            </w:r>
+          </w:p>
+        </w:tc>
+      </w:tr>
+      <w:tr>
+        <w:tc>
+          <w:tcPr/>
+          <w:p>
+            <w:pPr>
+              <w:pStyle w:val="Compact"/>
+            </w:pPr>
+            <w:r>
+              <w:t xml:space="preserve">Red</w:t>
+            </w:r>
+          </w:p>
+        </w:tc>
+        <w:tc>
+          <w:tcPr/>
+          <w:p>
+            <w:pPr>
+              <w:pStyle w:val="Compact"/>
+            </w:pPr>
+            <w:r>
+              <w:rPr>
+                <w:rStyle w:val="VerbatimChar"/>
+              </w:rPr>
+              <w:t xml:space="preserve">\red{x}</w:t>
+            </w:r>
+          </w:p>
+        </w:tc>
+        <w:tc>
+          <w:tcPr/>
+          <w:p>
+            <w:pPr>
+              <w:pStyle w:val="Compact"/>
+            </w:pPr>
+            <w:r>
+              <w:t xml:space="preserve">$\red{x}$</w:t>
+            </w:r>
+          </w:p>
+        </w:tc>
+      </w:tr>
+      <w:tr>
+        <w:tc>
+          <w:tcPr/>
+          <w:p>
+            <w:pPr>
+              <w:pStyle w:val="Compact"/>
+            </w:pPr>
+            <w:r>
+              <w:t xml:space="preserve">Blue</w:t>
+            </w:r>
+          </w:p>
+        </w:tc>
+        <w:tc>
+          <w:tcPr/>
+          <w:p>
+            <w:pPr>
+              <w:pStyle w:val="Compact"/>
+            </w:pPr>
+            <w:r>
+              <w:rPr>
+                <w:rStyle w:val="VerbatimChar"/>
+              </w:rPr>
+              <w:t xml:space="preserve">\blue{y}</w:t>
+            </w:r>
+          </w:p>
+        </w:tc>
+        <w:tc>
+          <w:tcPr/>
+          <w:p>
+            <w:pPr>
+              <w:pStyle w:val="Compact"/>
+            </w:pPr>
+            <w:r>
+              <w:t xml:space="preserve">$\blue{y}$</w:t>
+            </w:r>
+          </w:p>
+        </w:tc>
+      </w:tr>
+      <w:tr>
+        <w:tc>
+          <w:tcPr/>
+          <w:p>
+            <w:pPr>
+              <w:pStyle w:val="Compact"/>
+            </w:pPr>
+            <w:r>
+              <w:t xml:space="preserve">Green</w:t>
+            </w:r>
+          </w:p>
+        </w:tc>
+        <w:tc>
+          <w:tcPr/>
+          <w:p>
+            <w:pPr>
+              <w:pStyle w:val="Compact"/>
+            </w:pPr>
+            <w:r>
+              <w:rPr>
+                <w:rStyle w:val="VerbatimChar"/>
+              </w:rPr>
+              <w:t xml:space="preserve">\green{z}</w:t>
+            </w:r>
+          </w:p>
+        </w:tc>
+        <w:tc>
+          <w:tcPr/>
+          <w:p>
+            <w:pPr>
+              <w:pStyle w:val="Compact"/>
+            </w:pPr>
+            <w:r>
+              <w:t xml:space="preserve">$\green{z}$</w:t>
+            </w:r>
+          </w:p>
+        </w:tc>
+      </w:tr>
+      <w:tr>
+        <w:tc>
+          <w:tcPr/>
+          <w:p>
+            <w:pPr>
+              <w:pStyle w:val="Compact"/>
+            </w:pPr>
+            <w:r>
+              <w:t xml:space="preserve">Orange</w:t>
+            </w:r>
+          </w:p>
+        </w:tc>
+        <w:tc>
+          <w:tcPr/>
+          <w:p>
+            <w:pPr>
+              <w:pStyle w:val="Compact"/>
+            </w:pPr>
+            <w:r>
+              <w:rPr>
+                <w:rStyle w:val="VerbatimChar"/>
+              </w:rPr>
+              <w:t xml:space="preserve">\orange{\mu}</w:t>
+            </w:r>
+          </w:p>
+        </w:tc>
+        <w:tc>
+          <w:tcPr/>
+          <w:p>
+            <w:pPr>
+              <w:pStyle w:val="Compact"/>
+            </w:pPr>
+            <w:r>
+              <w:t xml:space="preserve">$\orange{\mu}$</w:t>
+            </w:r>
+          </w:p>
+        </w:tc>
+      </w:tr>
+      <w:tr>
+        <w:tc>
+          <w:tcPr/>
+          <w:p>
+            <w:pPr>
+              <w:pStyle w:val="Compact"/>
+            </w:pPr>
+            <w:r>
+              <w:t xml:space="preserve">Combined</w:t>
+            </w:r>
+          </w:p>
+        </w:tc>
+        <w:tc>
+          <w:tcPr/>
+          <w:p>
+            <w:pPr>
+              <w:pStyle w:val="Compact"/>
+            </w:pPr>
+            <w:r>
+              <w:rPr>
+                <w:rStyle w:val="VerbatimChar"/>
+              </w:rPr>
+              <w:t xml:space="preserve">\red{x} + \blue{y} = \green{z}</w:t>
+            </w:r>
+          </w:p>
+        </w:tc>
+        <w:tc>
+          <w:tcPr/>
+          <w:p>
+            <w:pPr>
+              <w:pStyle w:val="Compact"/>
+            </w:pPr>
+            <w:r>
+              <w:t xml:space="preserve">$\red{x} + \blue{y} = \green{z}$</w:t>
+            </w:r>
+          </w:p>
+        </w:tc>
+      </w:tr>
+      <w:tr>
+        <w:tc>
+          <w:tcPr/>
+          <w:p>
+            <w:pPr>
+              <w:pStyle w:val="Compact"/>
+            </w:pPr>
+            <w:r>
+              <w:t xml:space="preserve">Nested macros</w:t>
+            </w:r>
+          </w:p>
+        </w:tc>
+        <w:tc>
+          <w:tcPr/>
+          <w:p>
+            <w:pPr>
+              <w:pStyle w:val="Compact"/>
+            </w:pPr>
+            <w:r>
+              <w:rPr>
+                <w:rStyle w:val="VerbatimChar"/>
+              </w:rPr>
+              <w:t xml:space="preserve">X_i \sim_{\red{\ind}} \blue{\Normal}(\orange{\mu_i}, \green{\ss})</w:t>
+            </w:r>
+          </w:p>
+        </w:tc>
+        <w:tc>
+          <w:tcPr/>
+          <w:p>
+            <w:pPr>
+              <w:pStyle w:val="Compact"/>
+            </w:pPr>
+            <w:r>
+              <w:t xml:space="preserve">$X_i \sim_{\red{\ind}} \blue{\Normal}(\orange{\mu_i}, \green{\ss})$</w:t>
+            </w:r>
+          </w:p>
+        </w:tc>
+      </w:tr>
+    </w:tbl>
+    <w:p>
+      <w:pPr>
+        <w:pStyle w:val="BlockText"/>
+      </w:pPr>
+      <w:r>
+        <w:rPr>
+          <w:b/>
+          <w:bCs/>
+        </w:rPr>
+        <w:t xml:space="preserve">Note (docx):</w:t>
+      </w:r>
+      <w:r>
+        <w:t xml:space="preserve"> </w:t>
+      </w:r>
+      <w:r>
+        <w:t xml:space="preserve">as described above, the</w:t>
+      </w:r>
+      <w:r>
+        <w:t xml:space="preserve"> </w:t>
+      </w:r>
+      <w:r>
+        <w:rPr>
+          <w:rStyle w:val="VerbatimChar"/>
+        </w:rPr>
+        <w:t xml:space="preserve">include-in-header</w:t>
+      </w:r>
+      <w:r>
+        <w:t xml:space="preserve"> </w:t>
+      </w:r>
+      <w:r>
+        <w:t xml:space="preserve">strategy does not load macros for docx output, so the color macros (like all other macros) are unavailable there. For docx, use the</w:t>
+      </w:r>
+      <w:r>
+        <w:t xml:space="preserve"> </w:t>
+      </w:r>
+      <w:hyperlink r:id="rId12">
+        <w:r>
+          <w:rPr>
+            <w:rStyle w:val="Hyperlink"/>
+          </w:rPr>
+          <w:t xml:space="preserve">include shortcode strategy</w:t>
+        </w:r>
+      </w:hyperlink>
+      <w:r>
+        <w:t xml:space="preserve"> </w:t>
+      </w:r>
+      <w:r>
+        <w:t xml:space="preserve">instead.</w:t>
+      </w:r>
+    </w:p>
+    <w:bookmarkEnd w:id="13"/>
     <w:sectPr>
       <w:footnotePr>
         <w:numRestart w:val="eachSect"/>

</xml_diff>